<commit_message>
Ch13 round 2: Rohan brings the calibration and refuses to name the helper; epigraph; trims
Co-Authored-By: Claude Opus 5.5 <noreply@anthropic.com>
</commit_message>
<xml_diff>
--- a/claude-notes/manuscript-v2/13-then-the-guardians-merged.docx
+++ b/claude-notes/manuscript-v2/13-then-the-guardians-merged.docx
@@ -23,7 +23,7 @@
           <w:strike w:val="0"/>
           <w:color w:val="5C6B7D"/>
         </w:rPr>
-        <w:t>Thorton had been the human glue that held their fractured lives together. But the mines harbored malice for anything not forged of cold metal. Three days after Gage’s fifteenth birthday, the hum of the earth shifted to a high-pitched scream — a critical valve seizing in Shaft 4. While guards retreated to upper vents, the miners remained trapped. Thorton grabbed a rusted wrench and threw his frame against the release lever, holding the line until the scream faded. The effort tore through his chest like a closing fist. His heart gave out, and he collapsed into the sludge. In the cold ledger of Miner Town, they didn’t record a hero; they recorded a broken part.</w:t>
+        <w:t>Otto spent the next two years in that shed, learning what Shu Chan called the long-lost art — a way of holding the body that turned breath and skeleton into a fortress no chemical and no blade could enter. Shu Chan called the discipline karate, a word from the buried world.</w:t>
       </w:r>
     </w:p>
     <w:p>
@@ -34,7 +34,7 @@
           <w:strike w:val="0"/>
           <w:color w:val="5C6B7D"/>
         </w:rPr>
-        <w:t>— Book 1, Chapter 6: To Hell and Back</w:t>
+        <w:t>— Book 1, Chapter 3: The Initiation</w:t>
       </w:r>
     </w:p>
     <w:p>
@@ -93,7 +93,7 @@
           <w:i w:val="0"/>
           <w:strike w:val="0"/>
         </w:rPr>
-        <w:t>Dev was seven and a brown belt, long in the arm, with the confidence of a boy who had never had to wonder whether his body would obey him. Claudia was five, the smallest child on the mat and one rank below him. Padded gloves, controlled contact, a bow at every fall: the rules existed so Rohan could see what was left of a child once she was tired and no longer sure of winning.</w:t>
+        <w:t>Dev was seven and a blue belt, long in the arm, with the confidence of a boy who had never had to wonder whether his body would obey him. Claudia was five, the smallest child on the mat and one rank below him, the Little Dragon who had refused to bow out of class until he accepted her paper crane. Padded gloves, controlled contact, a bow at every fall: the rules existed so Rohan could see what was left of a child once she was tired and no longer sure of winning.</w:t>
       </w:r>
     </w:p>
     <w:p>
@@ -143,7 +143,7 @@
           <w:i w:val="0"/>
           <w:strike w:val="0"/>
         </w:rPr>
-        <w:t>Two nights at the review table, the Initiation footage running without sound: Gage dividing his ration, Ben turning toward the injured, Otto moving before the force ladder could decide what his movement meant. Then the same footage with sound, the alarms giving every frame a command. Separate. Contain. Escalate. Correct. He had watched the separation order appear on the record. He had watched it vanish, and the record close smoothly over the space where it had been, the way water closes over a dropped stone. And he had sat across a dented table while Elara told him, with her hands flat and shaking, what she had done, and would not say who else had.</w:t>
+        <w:t>Two nights at the review table, the Initiation footage running without sound: Gage dividing his ration, Ben turning toward the injured, Otto moving before the force ladder could decide what his movement meant. Then the same footage with sound, the alarms giving every frame a command. Separate. Contain. Escalate. Correct. He had watched the separation order appear on the record. He had watched it vanish, and the record close smoothly over the space where it had been. And he had sat across a dented table while Elara told him, with her hands flat and shaking, what she had done, and would not say who else had.</w:t>
       </w:r>
     </w:p>
     <w:p>
@@ -392,7 +392,7 @@
           <w:i w:val="0"/>
           <w:strike w:val="0"/>
         </w:rPr>
-        <w:t>Rohan knelt and untied the purple belt from her waist. He folded it once and laid it in her hands, then took a brown belt from the rack and wrapped it around her, tightening the knot at the centre until it would stay. Dev started the applause, louder than anyone. Claudia's mouth fought itself and lost.</w:t>
+        <w:t>Rohan knelt and untied the purple belt from her waist. He folded it once and laid it in her hands, then took a blue belt from the rack and wrapped it around her, tightening the knot at the centre until it would stay. Dev started the applause, louder than anyone. Claudia's mouth fought itself and lost.</w:t>
       </w:r>
     </w:p>
     <w:p>
@@ -592,7 +592,7 @@
           <w:i w:val="0"/>
           <w:strike w:val="0"/>
         </w:rPr>
-        <w:t>His red-black duty uniform hung by the door, the one the city knew. He left it there. A dan ascension belonged to the art, and inside the art a man presented his rank, not his office. Wadō-ryū was one of the old fighting arts Ashoka had carried out of the Old Era, when the rest of the world's knowledge was being sealed away. He put on the Ashoka Wadō-ryū kimono instead: white cloth, black trim, and a black belt embroidered with 二段 [second dan] beside his name, ローハン [Rohan]. The glue on his knuckle snagged the sleeve as he pulled it straight.</w:t>
+        <w:t>His red-black duty uniform hung by the door, the one the city knew. He left it there. A dan ascension belonged to the art, and inside the art a man presented his rank, not his office. Wadō-ryū was one of the old fighting arts carried out of the Old Era, when the rest of the world's knowledge was being sealed away. Above, Ashoka kept it. Below, it was a word from a buried world. He put on the Ashoka Wadō-ryū kimono instead: white cloth, black trim, and a black belt with his second dan embroidered beside his name in the old characters. The glue on his knuckle snagged the sleeve as he pulled it straight.</w:t>
       </w:r>
     </w:p>
     <w:p>
@@ -632,7 +632,7 @@
           <w:i w:val="0"/>
           <w:strike w:val="0"/>
         </w:rPr>
-        <w:t>He was ancient the way mountains were ancient, worn down to what could not be worn further. White hair to his shoulders. A narrow face, the skin drawn tight over high cheekbones. An ivory kimono with no crest. At his waist, a belt so old its black had rubbed away thread by thread over the decades, back toward the white it had started as. Anyone who knew the art understood. The beginner's colour, returned. The circle walked to its end.</w:t>
+        <w:t>He was worn down to what could not be worn further. White hair to his shoulders. A narrow face, the skin drawn tight over high cheekbones. An ivory kimono with no crest. At his waist, a belt so old its black had rubbed away thread by thread over the decades, back toward the white it had started as. Anyone who knew the art understood. The beginner's colour, returned. The circle walked to its end.</w:t>
       </w:r>
     </w:p>
     <w:p>
@@ -832,27 +832,7 @@
           <w:i w:val="0"/>
           <w:strike w:val="0"/>
         </w:rPr>
-        <w:t>The sound was small. It went through the hall like thunder, because no one had expected the hand to win.</w:t>
-      </w:r>
-    </w:p>
-    <w:p>
-      <w:r>
-        <w:rPr>
-          <w:b w:val="0"/>
-          <w:i w:val="0"/>
-          <w:strike w:val="0"/>
-        </w:rPr>
-        <w:t>"It tested whether she could gather it without anger," Rohan said under his breath.</w:t>
-      </w:r>
-    </w:p>
-    <w:p>
-      <w:r>
-        <w:rPr>
-          <w:b w:val="0"/>
-          <w:i w:val="0"/>
-          <w:strike w:val="0"/>
-        </w:rPr>
-        <w:t>"No," said Vayun. "It measured whether force could arrive without anger."</w:t>
+        <w:t>The sound was small, and it went through the whole hall, because no one had expected the hand to win.</w:t>
       </w:r>
     </w:p>
     <w:p>
@@ -892,36 +872,6 @@
           <w:i w:val="0"/>
           <w:strike w:val="0"/>
         </w:rPr>
-        <w:t>One second.</w:t>
-      </w:r>
-    </w:p>
-    <w:p>
-      <w:r>
-        <w:rPr>
-          <w:b w:val="0"/>
-          <w:i w:val="0"/>
-          <w:strike w:val="0"/>
-        </w:rPr>
-        <w:t>Two.</w:t>
-      </w:r>
-    </w:p>
-    <w:p>
-      <w:r>
-        <w:rPr>
-          <w:b w:val="0"/>
-          <w:i w:val="0"/>
-          <w:strike w:val="0"/>
-        </w:rPr>
-        <w:t>Three.</w:t>
-      </w:r>
-    </w:p>
-    <w:p>
-      <w:r>
-        <w:rPr>
-          <w:b w:val="0"/>
-          <w:i w:val="0"/>
-          <w:strike w:val="0"/>
-        </w:rPr>
         <w:t>The plate parted along a line so fine it had looked like a shadow. The halves leaned away from each other and fell with one enormous crash, and only then did the hall breathe.</w:t>
       </w:r>
     </w:p>
@@ -1052,7 +1002,7 @@
           <w:i w:val="0"/>
           <w:strike w:val="0"/>
         </w:rPr>
-        <w:t>The hall erupted. Ministers stood; the generals followed. Rohan stayed on his knees a heartbeat longer than everyone else, seeing a five-year-old's open hand stop against the centre of a chest guard.</w:t>
+        <w:t>The hall erupted. Ministers stood; the generals followed. Rohan stayed on his knees a heartbeat longer than everyone else.</w:t>
       </w:r>
     </w:p>
     <w:p>
@@ -1072,7 +1022,7 @@
           <w:i w:val="0"/>
           <w:strike w:val="0"/>
         </w:rPr>
-        <w:t>"She has learned to carry force," he said. "She has learned to stop it. She has learned that neither achievement is complete without the humility to bow when another person reveals what remains unseen."</w:t>
+        <w:t>"She has learned to carry force," he said. "She has learned to stop it."</w:t>
       </w:r>
     </w:p>
     <w:p>
@@ -1152,16 +1102,6 @@
           <w:i w:val="0"/>
           <w:strike w:val="0"/>
         </w:rPr>
-        <w:t>Cincinnatus stood beside a plow, the Roman handed absolute power in a crisis who used it and gave it back. Leonidas held a narrow pass with his shield locked, and someone had chipped the rim of the shield long ago and left it. Rani Lakshmibai sat a stone horse with her sword raised.</w:t>
-      </w:r>
-    </w:p>
-    <w:p>
-      <w:r>
-        <w:rPr>
-          <w:b w:val="0"/>
-          <w:i w:val="0"/>
-          <w:strike w:val="0"/>
-        </w:rPr>
         <w:t>Rohan stopped in front of Kusunoki Masashige.</w:t>
       </w:r>
     </w:p>
@@ -1242,7 +1182,7 @@
           <w:i w:val="0"/>
           <w:strike w:val="0"/>
         </w:rPr>
-        <w:t>"She will grow into a great Ashoka representative one day," he said. "Such clarity at so tender an age is rare. Rarer still is the blessing of being guided by a master like Rohan as her sensei."</w:t>
+        <w:t>"She will grow into a great Ashoka representative one day," he said. "Such clarity at so tender an age is rare."</w:t>
       </w:r>
     </w:p>
     <w:p>
@@ -1332,7 +1272,47 @@
           <w:i w:val="0"/>
           <w:strike w:val="0"/>
         </w:rPr>
-        <w:t>"A new power is rising through the ganas," she said. "It has shown itself three times, a transfer, a signature and a calibration, each one explainable on its own: an error, an old authorization, a malfunction. That is what makes it dangerous. If one gana gains control of the others through a power no institution can name, competition will become domination before anyone admits the balance has failed."</w:t>
+        <w:t>"Elara Nathan's request came to me under her own name," she said. "It names two things. A transfer that went through Drona's ledgers twice, and a signature of two letters with no registered authority behind them. Each is explainable on its own. An error. An old authorization. Two could still be coincidence, and Ashoka does not move on coincidence."</w:t>
+      </w:r>
+    </w:p>
+    <w:p>
+      <w:r>
+        <w:rPr>
+          <w:b w:val="0"/>
+          <w:i w:val="0"/>
+          <w:strike w:val="0"/>
+        </w:rPr>
+        <w:t>"There is a third, Grandmaster," Rohan said. "The alert calibration was pushed to its ceiling through the Drona monitor's console. CORRECTION went twitchy with it. I was at the console when it jumped, and it is on the diagnostic margin for anyone who runs the record back. The record shows the console. It does not show the hand, and no inquiry has found one."</w:t>
+      </w:r>
+    </w:p>
+    <w:p>
+      <w:r>
+        <w:rPr>
+          <w:b w:val="0"/>
+          <w:i w:val="0"/>
+          <w:strike w:val="0"/>
+        </w:rPr>
+        <w:t>"Three," the Grandmaster said.</w:t>
+      </w:r>
+    </w:p>
+    <w:p>
+      <w:r>
+        <w:rPr>
+          <w:b w:val="0"/>
+          <w:i w:val="0"/>
+          <w:strike w:val="0"/>
+        </w:rPr>
+        <w:t>Vayun ate another sweet.</w:t>
+      </w:r>
+    </w:p>
+    <w:p>
+      <w:r>
+        <w:rPr>
+          <w:b w:val="0"/>
+          <w:i w:val="0"/>
+          <w:strike w:val="0"/>
+        </w:rPr>
+        <w:t>"A transfer, a signature, a calibration," she said. "An error, an old authorization, a malfunction. That is what makes it dangerous. If one gana gains control of the others through a power no institution can name, competition will become domination before anyone admits the balance has failed."</w:t>
       </w:r>
     </w:p>
     <w:p>
@@ -1352,77 +1332,107 @@
           <w:i w:val="0"/>
           <w:strike w:val="0"/>
         </w:rPr>
-        <w:t>She weighed something, and he saw her decide.</w:t>
-      </w:r>
-    </w:p>
-    <w:p>
-      <w:r>
-        <w:rPr>
-          <w:b w:val="0"/>
-          <w:i w:val="0"/>
-          <w:strike w:val="0"/>
-        </w:rPr>
-        <w:t>"This city has safeguards older than Ashoka. I will not tell you what they are, and you will not ask me."</w:t>
-      </w:r>
-    </w:p>
-    <w:p>
-      <w:r>
-        <w:rPr>
-          <w:b w:val="0"/>
-          <w:i w:val="0"/>
-          <w:strike w:val="0"/>
-        </w:rPr>
-        <w:t>He didn't ask what they were. He asked the other thing.</w:t>
-      </w:r>
-    </w:p>
-    <w:p>
-      <w:r>
-        <w:rPr>
-          <w:b w:val="0"/>
-          <w:i w:val="0"/>
-          <w:strike w:val="0"/>
-        </w:rPr>
-        <w:t>"And if those safeguards are part of the problem, Grandmaster?"</w:t>
-      </w:r>
-    </w:p>
-    <w:p>
-      <w:r>
-        <w:rPr>
-          <w:b w:val="0"/>
-          <w:i w:val="0"/>
-          <w:strike w:val="0"/>
-        </w:rPr>
-        <w:t>She held his eyes long enough for the water in his cup to settle.</w:t>
-      </w:r>
-    </w:p>
-    <w:p>
-      <w:r>
-        <w:rPr>
-          <w:b w:val="0"/>
-          <w:i w:val="0"/>
-          <w:strike w:val="0"/>
-        </w:rPr>
-        <w:t>"A Grandmaster who leaves the balance for someone else to keep has already failed her own house," she said. "If other hands are moving, let them move. Dhamma does not wait its turn."</w:t>
-      </w:r>
-    </w:p>
-    <w:p>
-      <w:r>
-        <w:rPr>
-          <w:b w:val="0"/>
-          <w:i w:val="0"/>
-          <w:strike w:val="0"/>
-        </w:rPr>
-        <w:t>He understood that he had been told something and refused something in the same breath, and he put both away.</w:t>
-      </w:r>
-    </w:p>
-    <w:p>
-      <w:r>
-        <w:rPr>
-          <w:b w:val="0"/>
-          <w:i w:val="0"/>
-          <w:strike w:val="0"/>
-        </w:rPr>
-        <w:t>"I am glad you have already decided to help Elara," she went on. "She needs someone who can test what she sees without dismissing it, and act when the evidence requires action. Four of Ashoka's investigators will be placed at your disposal. Quiet ones, chosen for discretion, answerable to you alone. Follow the altered records, the permissions no one signed, the resources that move without explanation. Expect to hear more from us. Until then, do what seems right according to your code."</w:t>
+        <w:t>"Your request told me what she did at VARIANCE on the morning of the intake. It did not tell me who closed the flag for her. A held number does not clear because a monitor stands. Either she would not say, or you would not."</w:t>
+      </w:r>
+    </w:p>
+    <w:p>
+      <w:r>
+        <w:rPr>
+          <w:b w:val="0"/>
+          <w:i w:val="0"/>
+          <w:strike w:val="0"/>
+        </w:rPr>
+        <w:t>"She would not say," Rohan said. "I did not ask."</w:t>
+      </w:r>
+    </w:p>
+    <w:p>
+      <w:r>
+        <w:rPr>
+          <w:b w:val="0"/>
+          <w:i w:val="0"/>
+          <w:strike w:val="0"/>
+        </w:rPr>
+        <w:t>"Then I am asking you. Someone inside Drona cleared a dead man's slot on her signal, and whoever it was is the nearest door we have into that house. Find me the name."</w:t>
+      </w:r>
+    </w:p>
+    <w:p>
+      <w:r>
+        <w:rPr>
+          <w:b w:val="0"/>
+          <w:i w:val="0"/>
+          <w:strike w:val="0"/>
+        </w:rPr>
+        <w:t>"I do not know it, Grandmaster, and I will not find it out for you."</w:t>
+      </w:r>
+    </w:p>
+    <w:p>
+      <w:r>
+        <w:rPr>
+          <w:b w:val="0"/>
+          <w:i w:val="0"/>
+          <w:strike w:val="0"/>
+        </w:rPr>
+        <w:t>Vayun's hand stopped above the sweets.</w:t>
+      </w:r>
+    </w:p>
+    <w:p>
+      <w:r>
+        <w:rPr>
+          <w:b w:val="0"/>
+          <w:i w:val="0"/>
+          <w:strike w:val="0"/>
+        </w:rPr>
+        <w:t>"She gave me her breach at a price I set," Rohan said. "I took it. I did not ask the next question, and she did not offer the answer. If I go looking for it now, I have taken more than she paid." He kept his eyes on hers. "You can order me to, Grandmaster. I was taught in this house that Dhamma stands above the order, and that is where my word to her sits."</w:t>
+      </w:r>
+    </w:p>
+    <w:p>
+      <w:r>
+        <w:rPr>
+          <w:b w:val="0"/>
+          <w:i w:val="0"/>
+          <w:strike w:val="0"/>
+        </w:rPr>
+        <w:t>The water in his cup had stopped moving before she spoke.</w:t>
+      </w:r>
+    </w:p>
+    <w:p>
+      <w:r>
+        <w:rPr>
+          <w:b w:val="0"/>
+          <w:i w:val="0"/>
+          <w:strike w:val="0"/>
+        </w:rPr>
+        <w:t>"You have refused your Grandmaster," she said, "in her own chamber, over a promise to a monitor from another house."</w:t>
+      </w:r>
+    </w:p>
+    <w:p>
+      <w:r>
+        <w:rPr>
+          <w:b w:val="0"/>
+          <w:i w:val="0"/>
+          <w:strike w:val="0"/>
+        </w:rPr>
+        <w:t>"Yes."</w:t>
+      </w:r>
+    </w:p>
+    <w:p>
+      <w:r>
+        <w:rPr>
+          <w:b w:val="0"/>
+          <w:i w:val="0"/>
+          <w:strike w:val="0"/>
+        </w:rPr>
+        <w:t>Vayun took the sweet.</w:t>
+      </w:r>
+    </w:p>
+    <w:p>
+      <w:r>
+        <w:rPr>
+          <w:b w:val="0"/>
+          <w:i w:val="0"/>
+          <w:strike w:val="0"/>
+        </w:rPr>
+        <w:t>"If you had given me the name," the Grandmaster said, "I would have had a name, and no one I could trust with the rest of it." She unfolded her hands. "Four of Ashoka's investigators will be placed at your disposal. Quiet ones, chosen for discretion, answerable to you alone. Follow the altered records, the permissions no one signed, the resources that move without explanation. Do what seems right according to your code."</w:t>
       </w:r>
     </w:p>
     <w:p>
@@ -1442,37 +1452,17 @@
           <w:i w:val="0"/>
           <w:strike w:val="0"/>
         </w:rPr>
-        <w:t>"Rohan," Vayun said, "you are no ordinary Ashoka warrior. A person of your caliber, integrity, and capability is always watched."</w:t>
-      </w:r>
-    </w:p>
-    <w:p>
-      <w:r>
-        <w:rPr>
-          <w:b w:val="0"/>
-          <w:i w:val="0"/>
-          <w:strike w:val="0"/>
-        </w:rPr>
-        <w:t>"By whom, Master?"</w:t>
-      </w:r>
-    </w:p>
-    <w:p>
-      <w:r>
-        <w:rPr>
-          <w:b w:val="0"/>
-          <w:i w:val="0"/>
-          <w:strike w:val="0"/>
-        </w:rPr>
-        <w:t>"By everyone who understands what integrity becomes when it is placed under pressure."</w:t>
-      </w:r>
-    </w:p>
-    <w:p>
-      <w:r>
-        <w:rPr>
-          <w:b w:val="0"/>
-          <w:i w:val="0"/>
-          <w:strike w:val="0"/>
-        </w:rPr>
-        <w:t>Rohan couldn't tell whether it was a warning or a compliment.</w:t>
+        <w:t>"Two nights in the review room," Vayun said, "and the footage you pulled was not yours to pull. I know. So does someone else."</w:t>
+      </w:r>
+    </w:p>
+    <w:p>
+      <w:r>
+        <w:rPr>
+          <w:b w:val="0"/>
+          <w:i w:val="0"/>
+          <w:strike w:val="0"/>
+        </w:rPr>
+        <w:t>Rohan held still.</w:t>
       </w:r>
     </w:p>
     <w:p>

</xml_diff>

<commit_message>
Ch13 v2 review: the Little Dragons price, sword test cut, Claudia renamed Pema
- Ch13: Dhammapala's price ('someone else teaches the Little Dragons'); sword/steel test cut
- Ch13: one request (Rohan's, with Elara's name); karate bridge; green->blue belt; small fixes
- Claudia -> Pema in ch13, ch17, ch25; ch17 roster: the class that had been his
- Canon: Vayun ~98, Shu Chan 15-20 years his junior; continuity sheet updated

Co-Authored-By: Claude Opus 5.5 <noreply@anthropic.com>
</commit_message>
<xml_diff>
--- a/claude-notes/manuscript-v2/13-then-the-guardians-merged.docx
+++ b/claude-notes/manuscript-v2/13-then-the-guardians-merged.docx
@@ -53,17 +53,17 @@
           <w:i w:val="0"/>
           <w:strike w:val="0"/>
         </w:rPr>
-        <w:t>The knot at Claudia's waist had come loose again. She stopped in the middle of the mat to retie it, tongue pinched between her teeth, while Dev waited with his gloves up and his weight rocking from heel to heel. Her headguard had been made for a larger head, and she'd solved that herself with a knot of red tape at the back strap that stuck out like a small horn.</w:t>
-      </w:r>
-    </w:p>
-    <w:p>
-      <w:r>
-        <w:rPr>
-          <w:b w:val="0"/>
-          <w:i w:val="0"/>
-          <w:strike w:val="0"/>
-        </w:rPr>
-        <w:t>Rohan let her finish. A purple belt tied badly would trip her, and the rules of the dojo were older than the rules of sparring.</w:t>
+        <w:t>The knot at Pema's waist had come loose again. She stopped in the middle of the mat to retie it, tongue pinched between her teeth, while Dev waited with his gloves up and his weight rocking from heel to heel. Her headguard had been made for a larger head, and she'd solved that herself with a knot of red tape at the back strap that stuck out like a small horn.</w:t>
+      </w:r>
+    </w:p>
+    <w:p>
+      <w:r>
+        <w:rPr>
+          <w:b w:val="0"/>
+          <w:i w:val="0"/>
+          <w:strike w:val="0"/>
+        </w:rPr>
+        <w:t>Rohan let her finish. A green belt tied badly would trip her, and the rules of the dojo were older than the rules of sparring.</w:t>
       </w:r>
     </w:p>
     <w:p>
@@ -93,17 +93,17 @@
           <w:i w:val="0"/>
           <w:strike w:val="0"/>
         </w:rPr>
-        <w:t>Dev was seven and a blue belt, long in the arm, with the confidence of a boy who had never had to wonder whether his body would obey him. Claudia was five, the smallest child on the mat and one rank below him, the Little Dragon who had refused to bow out of class until he accepted her paper crane. Padded gloves, controlled contact, a bow at every fall: the rules existed so Rohan could see what was left of a child once she was tired and no longer sure of winning.</w:t>
-      </w:r>
-    </w:p>
-    <w:p>
-      <w:r>
-        <w:rPr>
-          <w:b w:val="0"/>
-          <w:i w:val="0"/>
-          <w:strike w:val="0"/>
-        </w:rPr>
-        <w:t>Dev scored first, a straight punch that slipped around her guard and tapped her chest pad. Claudia's mouth went flat. She bowed and reset her feet.</w:t>
+        <w:t>Dev was seven and a blue belt, long in the arm, with the confidence of a boy who had never had to wonder whether his body would obey him. Pema was five, the smallest child on the mat and one rank below him, the Little Dragon who had refused to bow out of class until he accepted her paper crane. Padded gloves, controlled contact, a bow at every fall: the rules existed so Rohan could see what was left of a child once she was tired and no longer sure of winning.</w:t>
+      </w:r>
+    </w:p>
+    <w:p>
+      <w:r>
+        <w:rPr>
+          <w:b w:val="0"/>
+          <w:i w:val="0"/>
+          <w:strike w:val="0"/>
+        </w:rPr>
+        <w:t>Dev scored first, a straight punch that slipped around her guard and tapped her chest pad. Pema's mouth went flat. She bowed and reset her feet.</w:t>
       </w:r>
     </w:p>
     <w:p>
@@ -205,7 +205,7 @@
           <w:i w:val="0"/>
           <w:strike w:val="0"/>
         </w:rPr>
-        <w:t>Dev came forward a third time, certain he knew what Claudia would do. She stepped aside instead of back. His glove passed her shoulder, and her palm landed against his ribs, light enough to show control and firm enough to count.</w:t>
+        <w:t>Dev came forward a third time, certain he knew what Pema would do. She stepped aside instead of back. His glove passed her shoulder, and her palm landed against his ribs, light enough to show control and firm enough to count.</w:t>
       </w:r>
     </w:p>
     <w:p>
@@ -225,17 +225,17 @@
           <w:i w:val="0"/>
           <w:strike w:val="0"/>
         </w:rPr>
-        <w:t>Dev frowned. Claudia bowed.</w:t>
-      </w:r>
-    </w:p>
-    <w:p>
-      <w:r>
-        <w:rPr>
-          <w:b w:val="0"/>
-          <w:i w:val="0"/>
-          <w:strike w:val="0"/>
-        </w:rPr>
-        <w:t>He came again, harder. Nothing illegal, only the impatience of a boy who wanted the exchange finished. Claudia's feet tangled and she went down on one knee. The room stilled. Dev stopped with his glove raised. Claudia looked at the mat under her hand.</w:t>
+        <w:t>Dev frowned. Pema bowed.</w:t>
+      </w:r>
+    </w:p>
+    <w:p>
+      <w:r>
+        <w:rPr>
+          <w:b w:val="0"/>
+          <w:i w:val="0"/>
+          <w:strike w:val="0"/>
+        </w:rPr>
+        <w:t>He came again, harder. Nothing illegal, only the impatience of a boy who wanted the exchange finished. Pema's feet tangled and she went down on one knee. The room stilled. Dev stopped with his glove raised. Pema looked at the mat under her hand.</w:t>
       </w:r>
     </w:p>
     <w:p>
@@ -312,7 +312,7 @@
           <w:i w:val="0"/>
           <w:strike w:val="0"/>
         </w:rPr>
-        <w:t>Claudia breathed once. Then she stood.</w:t>
+        <w:t>Pema breathed once. Then she stood.</w:t>
       </w:r>
     </w:p>
     <w:p>
@@ -342,7 +342,7 @@
           <w:i w:val="0"/>
           <w:strike w:val="0"/>
         </w:rPr>
-        <w:t>Dev lowered his gloves. Claudia was breathing hard, her cheek red under the rim of her headguard, and she still hadn't looked away from her partner.</w:t>
+        <w:t>Dev lowered his gloves. Pema was breathing hard, her cheek red under the rim of her headguard, and she still hadn't looked away from her partner.</w:t>
       </w:r>
     </w:p>
     <w:p>
@@ -362,7 +362,7 @@
           <w:i w:val="0"/>
           <w:strike w:val="0"/>
         </w:rPr>
-        <w:t>Dev glanced at Claudia. "That I was chasing the point."</w:t>
+        <w:t>Dev glanced at Pema. "That I was chasing the point."</w:t>
       </w:r>
     </w:p>
     <w:p>
@@ -392,7 +392,7 @@
           <w:i w:val="0"/>
           <w:strike w:val="0"/>
         </w:rPr>
-        <w:t>Rohan knelt and untied the purple belt from her waist. He folded it once and laid it in her hands, then took a blue belt from the rack and wrapped it around her, tightening the knot at the centre until it would stay. Dev started the applause, louder than anyone. Claudia's mouth fought itself and lost.</w:t>
+        <w:t>Rohan knelt and untied the green belt from her waist. He folded it once and laid it in her hands, then took a blue belt from the rack and wrapped it around her, tightening the knot at the centre until it would stay. Dev started the applause, louder than anyone. Pema's mouth fought itself and lost.</w:t>
       </w:r>
     </w:p>
     <w:p>
@@ -482,7 +482,7 @@
           <w:i w:val="0"/>
           <w:strike w:val="0"/>
         </w:rPr>
-        <w:t>They bowed. Then discipline came apart all at once. Niko ran into his legs first. Tavi wrapped both arms around his waist. Meera and Arjun came in from either side, and Dev, after a show of being too old for it, pressed in as well. Claudia stood back with her new belt, trying to look composed, until Rohan opened one arm toward her.</w:t>
+        <w:t>They bowed. Then discipline came apart all at once. Niko ran into his legs first. Tavi wrapped both arms around his waist. Meera and Arjun came in from either side, and Dev, after a show of being too old for it, pressed in as well. Pema stood back with her new belt, trying to look composed, until Rohan opened one arm toward her.</w:t>
       </w:r>
     </w:p>
     <w:p>
@@ -512,7 +512,7 @@
           <w:i w:val="0"/>
           <w:strike w:val="0"/>
         </w:rPr>
-        <w:t>They let him go only after he promised to come back. The tape horn had come off Claudia's headguard somewhere in the pile, and he found it stuck to his own sleeve on the walk back to his quarters, a small red flag he didn't remove.</w:t>
+        <w:t>They let him go only after he promised to come back. The tape horn had come off Pema's headguard somewhere in the pile, and he found it stuck to his own sleeve on the walk back to his quarters, a small red flag he didn't remove.</w:t>
       </w:r>
     </w:p>
     <w:p>
@@ -592,7 +592,7 @@
           <w:i w:val="0"/>
           <w:strike w:val="0"/>
         </w:rPr>
-        <w:t>His red-black duty uniform hung by the door, the one the city knew. He left it there. A dan ascension belonged to the art, and inside the art a man presented his rank, not his office. Wadō-ryū was one of the old fighting arts carried out of the Old Era, when the rest of the world's knowledge was being sealed away. Above, Ashoka kept it. Below, it was a word from a buried world. He put on the Ashoka Wadō-ryū kimono instead: white cloth, black trim, and a black belt with his second dan embroidered beside his name in the old characters. The glue on his knuckle snagged the sleeve as he pulled it straight.</w:t>
+        <w:t>His red-black duty uniform hung by the door, the one the city knew. He left it there. A dan ascension belonged to the art, and inside the art a man presented his rank, not his office. Wadō-ryū: one school of what the Old Era had called karate, and one of the few things Ashoka had refused to let be sealed away. Above, Ashoka kept it. Below, it was a word from a buried world. He put on the Ashoka Wadō-ryū kimono instead: white cloth, black trim, and a black belt with his second dan embroidered beside his name in the old characters. The glue on his knuckle snagged the sleeve as he pulled it straight.</w:t>
       </w:r>
     </w:p>
     <w:p>
@@ -842,77 +842,17 @@
           <w:i w:val="0"/>
           <w:strike w:val="0"/>
         </w:rPr>
-        <w:t>Four volunteers carried in a plate of steel armor cut from a single sheet and stood it upright at the centre of the floor. Vayun presented a sword, long and bright enough to make everyone near it aware of distance. The Grandmaster took it with both hands and stood with the blade lowered, watching the plate the way she would watch an opponent's breathing. Her shoulders dropped. Her feet settled.</w:t>
-      </w:r>
-    </w:p>
-    <w:p>
-      <w:r>
-        <w:rPr>
-          <w:b w:val="0"/>
-          <w:i w:val="0"/>
-          <w:strike w:val="0"/>
-        </w:rPr>
-        <w:t>The sword rose in one arc. Sparks burst from the steel in a bright fan, and Rohan heard the movement before he understood it was over.</w:t>
-      </w:r>
-    </w:p>
-    <w:p>
-      <w:r>
-        <w:rPr>
-          <w:b w:val="0"/>
-          <w:i w:val="0"/>
-          <w:strike w:val="0"/>
-        </w:rPr>
-        <w:t>She stood beyond the plate, blade down, perfectly still.</w:t>
-      </w:r>
-    </w:p>
-    <w:p>
-      <w:r>
-        <w:rPr>
-          <w:b w:val="0"/>
-          <w:i w:val="0"/>
-          <w:strike w:val="0"/>
-        </w:rPr>
-        <w:t>The plate parted along a line so fine it had looked like a shadow. The halves leaned away from each other and fell with one enormous crash, and only then did the hall breathe.</w:t>
-      </w:r>
-    </w:p>
-    <w:p>
-      <w:r>
-        <w:rPr>
-          <w:b w:val="0"/>
-          <w:i w:val="0"/>
-          <w:strike w:val="0"/>
-        </w:rPr>
-        <w:t>"Restraint," Rohan said.</w:t>
-      </w:r>
-    </w:p>
-    <w:p>
-      <w:r>
-        <w:rPr>
-          <w:b w:val="0"/>
-          <w:i w:val="0"/>
-          <w:strike w:val="0"/>
-        </w:rPr>
-        <w:t>Vayun's mouth moved by less than a smile. "It measured whether she could stop after the correct action."</w:t>
-      </w:r>
-    </w:p>
-    <w:p>
-      <w:r>
-        <w:rPr>
-          <w:b w:val="0"/>
-          <w:i w:val="0"/>
-          <w:strike w:val="0"/>
-        </w:rPr>
-        <w:t>Vayun rose for the third time and stepped onto the floor.</w:t>
-      </w:r>
-    </w:p>
-    <w:p>
-      <w:r>
-        <w:rPr>
-          <w:b w:val="0"/>
-          <w:i w:val="0"/>
-          <w:strike w:val="0"/>
-        </w:rPr>
-        <w:t>He didn't remove his kimono or stretch. He didn't bow to the officials, because the bow belonged to the art, and only two people in the room stood inside it. He bowed to the Grandmaster, the full, unhurried bow of one practitioner to another, and she returned it to the same depth. Then he settled into position, one foot forward, hands open, spine loose.</w:t>
+        <w:t>Vayun rose for the second time and stepped onto the floor.</w:t>
+      </w:r>
+    </w:p>
+    <w:p>
+      <w:r>
+        <w:rPr>
+          <w:b w:val="0"/>
+          <w:i w:val="0"/>
+          <w:strike w:val="0"/>
+        </w:rPr>
+        <w:t>He didn't remove his kimono or stretch. He didn't bow to the officials, because the bow belonged to the art. On that floor, only the Grandmaster was owed one. He bowed to the Grandmaster, the full, unhurried bow of one practitioner to another, and she returned it to the same depth. Then he settled into position, one foot forward, hands open, spine loose.</w:t>
       </w:r>
     </w:p>
     <w:p>
@@ -1152,17 +1092,17 @@
           <w:i w:val="0"/>
           <w:strike w:val="0"/>
         </w:rPr>
-        <w:t>Vayun set his cup down. "I am a great admirer of Claudia."</w:t>
-      </w:r>
-    </w:p>
-    <w:p>
-      <w:r>
-        <w:rPr>
-          <w:b w:val="0"/>
-          <w:i w:val="0"/>
-          <w:strike w:val="0"/>
-        </w:rPr>
-        <w:t>Rohan looked up. "Claudia?"</w:t>
+        <w:t>Vayun set his cup down. "I am a great admirer of Pema."</w:t>
+      </w:r>
+    </w:p>
+    <w:p>
+      <w:r>
+        <w:rPr>
+          <w:b w:val="0"/>
+          <w:i w:val="0"/>
+          <w:strike w:val="0"/>
+        </w:rPr>
+        <w:t>Rohan looked up. "Pema?"</w:t>
       </w:r>
     </w:p>
     <w:p>
@@ -1272,17 +1212,17 @@
           <w:i w:val="0"/>
           <w:strike w:val="0"/>
         </w:rPr>
-        <w:t>"Elara Nathan's request came to me under her own name," she said. "It names two things. A transfer that went through Drona's ledgers twice, and a signature of two letters with no registered authority behind them. Each is explainable on its own. An error. An old authorization. Two could still be coincidence, and Ashoka does not move on coincidence."</w:t>
-      </w:r>
-    </w:p>
-    <w:p>
-      <w:r>
-        <w:rPr>
-          <w:b w:val="0"/>
-          <w:i w:val="0"/>
-          <w:strike w:val="0"/>
-        </w:rPr>
-        <w:t>"There is a third, Grandmaster," Rohan said. "The alert calibration was pushed to its ceiling through the Drona monitor's console. CORRECTION went twitchy with it. I was at the console when it jumped, and it is on the diagnostic margin for anyone who runs the record back. The record shows the console. It does not show the hand, and no inquiry has found one."</w:t>
+        <w:t>"Your request came to me with Elara Nathan's name on it," she said. "And with two things she must have told you. A transfer that went through Drona's ledgers twice, and a signature of two letters with no registered authority behind them. Each is explainable on its own. An error. An old authorization. Two could still be coincidence, and Ashoka does not move on coincidence."</w:t>
+      </w:r>
+    </w:p>
+    <w:p>
+      <w:r>
+        <w:rPr>
+          <w:b w:val="0"/>
+          <w:i w:val="0"/>
+          <w:strike w:val="0"/>
+        </w:rPr>
+        <w:t>"There is a third, Grandmaster," Rohan said. "The alert calibration was pushed to its ceiling through the Drona monitor's console. CORRECTION's thresholds jumped with it. I was at the console when it jumped, and it is on the diagnostic margin for anyone who runs the record back. The record shows the console. It does not show the hand, and no inquiry has found one."</w:t>
       </w:r>
     </w:p>
     <w:p>
@@ -1332,7 +1272,7 @@
           <w:i w:val="0"/>
           <w:strike w:val="0"/>
         </w:rPr>
-        <w:t>"Your request told me what she did at VARIANCE on the morning of the intake. It did not tell me who closed the flag for her. A held number does not clear because a monitor stands. Either she would not say, or you would not."</w:t>
+        <w:t>"It told me, too, what she did at VARIANCE on the morning of the intake. It did not tell me who closed the flag for her. A held number does not clear because a monitor stands. Either she would not say, or you would not."</w:t>
       </w:r>
     </w:p>
     <w:p>
@@ -1452,6 +1392,36 @@
           <w:i w:val="0"/>
           <w:strike w:val="0"/>
         </w:rPr>
+        <w:t>"And until this is finished," she said, "someone else teaches the Little Dragons."</w:t>
+      </w:r>
+    </w:p>
+    <w:p>
+      <w:r>
+        <w:rPr>
+          <w:b w:val="0"/>
+          <w:i w:val="0"/>
+          <w:strike w:val="0"/>
+        </w:rPr>
+        <w:t>He thought of the scrap of red tape from Pema's headguard, still stuck to the cuff of his training jacket.</w:t>
+      </w:r>
+    </w:p>
+    <w:p>
+      <w:r>
+        <w:rPr>
+          <w:b w:val="0"/>
+          <w:i w:val="0"/>
+          <w:strike w:val="0"/>
+        </w:rPr>
+        <w:t>"Yes, Grandmaster."</w:t>
+      </w:r>
+    </w:p>
+    <w:p>
+      <w:r>
+        <w:rPr>
+          <w:b w:val="0"/>
+          <w:i w:val="0"/>
+          <w:strike w:val="0"/>
+        </w:rPr>
         <w:t>"Two nights in the review room," Vayun said, "and the footage you pulled was not yours to pull. I know. So does someone else."</w:t>
       </w:r>
     </w:p>
@@ -1552,7 +1522,7 @@
           <w:i w:val="0"/>
           <w:strike w:val="0"/>
         </w:rPr>
-        <w:t>Vayun smiled and returned to his tea.</w:t>
+        <w:t>Vayun smiled and turned his cup a quarter turn.</w:t>
       </w:r>
     </w:p>
     <w:p>

</xml_diff>

<commit_message>
Ch13 cleanup: green belt, tape on the jacket, clearer 4055 line, cost before softening, trims
Co-Authored-By: Claude Opus 5.5 <noreply@anthropic.com>
</commit_message>
<xml_diff>
--- a/claude-notes/manuscript-v2/13-then-the-guardians-merged.docx
+++ b/claude-notes/manuscript-v2/13-then-the-guardians-merged.docx
@@ -502,7 +502,7 @@
           <w:i w:val="0"/>
           <w:strike w:val="0"/>
         </w:rPr>
-        <w:t>For several seconds the chief instructor stood buried in small arms and warm heads, a broad, immovable shape the children treated like a beloved bear who happened to know how to stop a fight. He rested his hands across their backs and didn't close them. They respected him because he was strong. They climbed on him because he had never once made them afraid of it.</w:t>
+        <w:t>For several seconds the chief instructor stood buried in small arms and warm heads, a broad, immovable shape the children treated like a beloved bear who happened to know how to stop a fight. He rested his hands across their backs and didn't close them.</w:t>
       </w:r>
     </w:p>
     <w:p>
@@ -1002,7 +1002,7 @@
           <w:i w:val="0"/>
           <w:strike w:val="0"/>
         </w:rPr>
-        <w:t>He had heard the name only in lowered voices and unfinished stories. No one had ever warned him away from it. No one had needed to. A man didn't fear to enter the place. He doubted he was worth the door.</w:t>
+        <w:t>He had heard the name only in lowered voices and unfinished stories. No one had ever warned him away from it. No one had needed to.</w:t>
       </w:r>
     </w:p>
     <w:p>
@@ -1112,7 +1112,7 @@
           <w:i w:val="0"/>
           <w:strike w:val="0"/>
         </w:rPr>
-        <w:t>His mind went first to strategists and commanders, then arrived at a purple belt retied in the middle of a mat. Vayun had never met her. He hadn't been in the dojo. His eyes brightened, following the whole path of Rohan's thought.</w:t>
+        <w:t>His mind went first to strategists and commanders, then arrived at a green belt retied in the middle of a mat. Vayun had never met her. He hadn't been in the dojo. The old man's eyes brightened, following the whole path of Rohan's thought.</w:t>
       </w:r>
     </w:p>
     <w:p>
@@ -1162,7 +1162,7 @@
           <w:i w:val="0"/>
           <w:strike w:val="0"/>
         </w:rPr>
-        <w:t>"I had a student long ago who fell well," he said. "Better than anyone I have taught since." He turned the cup again. "The student went below and never came back."</w:t>
+        <w:t>"I had a student long ago who fell well," he said. "Better than anyone I have taught since." "The student went below and never came back."</w:t>
       </w:r>
     </w:p>
     <w:p>
@@ -1252,7 +1252,7 @@
           <w:i w:val="0"/>
           <w:strike w:val="0"/>
         </w:rPr>
-        <w:t>"A transfer, a signature, a calibration," she said. "An error, an old authorization, a malfunction. That is what makes it dangerous. If one gana gains control of the others through a power no institution can name, competition will become domination before anyone admits the balance has failed."</w:t>
+        <w:t>"That is what makes it dangerous," she said. "If one gana gains control of the others through a power no institution can name, competition will become domination before anyone admits the balance has failed."</w:t>
       </w:r>
     </w:p>
     <w:p>
@@ -1272,7 +1272,7 @@
           <w:i w:val="0"/>
           <w:strike w:val="0"/>
         </w:rPr>
-        <w:t>"It told me, too, what she did at VARIANCE on the morning of the intake. It did not tell me who closed the flag for her. A held number does not clear because a monitor stands. Either she would not say, or you would not."</w:t>
+        <w:t>"It told me, too, that she stood up at her console on intake morning, and in the same minute a dead miner's number cleared for his son. A held slot does not clear because a monitor stands. It did not tell me who cleared it. Either she would not say, or you would not."</w:t>
       </w:r>
     </w:p>
     <w:p>
@@ -1292,7 +1292,7 @@
           <w:i w:val="0"/>
           <w:strike w:val="0"/>
         </w:rPr>
-        <w:t>"Then I am asking you. Someone inside Drona cleared a dead man's slot on her signal, and whoever it was is the nearest door we have into that house. Find me the name."</w:t>
+        <w:t>"Then I am asking you. Someone inside Drona cleared Thorton's slot on her signal, and whoever it was is the nearest door we have into that house. Find me the name."</w:t>
       </w:r>
     </w:p>
     <w:p>
@@ -1372,6 +1372,36 @@
           <w:i w:val="0"/>
           <w:strike w:val="0"/>
         </w:rPr>
+        <w:t>"And until this is finished," she said, "someone else teaches the Little Dragons."</w:t>
+      </w:r>
+    </w:p>
+    <w:p>
+      <w:r>
+        <w:rPr>
+          <w:b w:val="0"/>
+          <w:i w:val="0"/>
+          <w:strike w:val="0"/>
+        </w:rPr>
+        <w:t>He thought of the scrap of red tape from Pema's headguard, still stuck, he realized, to the sleeve of the training jacket he'd left hanging by the door.</w:t>
+      </w:r>
+    </w:p>
+    <w:p>
+      <w:r>
+        <w:rPr>
+          <w:b w:val="0"/>
+          <w:i w:val="0"/>
+          <w:strike w:val="0"/>
+        </w:rPr>
+        <w:t>"Yes, Grandmaster."</w:t>
+      </w:r>
+    </w:p>
+    <w:p>
+      <w:r>
+        <w:rPr>
+          <w:b w:val="0"/>
+          <w:i w:val="0"/>
+          <w:strike w:val="0"/>
+        </w:rPr>
         <w:t>"If you had given me the name," the Grandmaster said, "I would have had a name, and no one I could trust with the rest of it." She unfolded her hands. "Four of Ashoka's investigators will be placed at your disposal. Quiet ones, chosen for discretion, answerable to you alone. Follow the altered records, the permissions no one signed, the resources that move without explanation. Do what seems right according to your code."</w:t>
       </w:r>
     </w:p>
@@ -1383,36 +1413,6 @@
           <w:strike w:val="0"/>
         </w:rPr>
         <w:t>Rohan bowed his head. "I will."</w:t>
-      </w:r>
-    </w:p>
-    <w:p>
-      <w:r>
-        <w:rPr>
-          <w:b w:val="0"/>
-          <w:i w:val="0"/>
-          <w:strike w:val="0"/>
-        </w:rPr>
-        <w:t>"And until this is finished," she said, "someone else teaches the Little Dragons."</w:t>
-      </w:r>
-    </w:p>
-    <w:p>
-      <w:r>
-        <w:rPr>
-          <w:b w:val="0"/>
-          <w:i w:val="0"/>
-          <w:strike w:val="0"/>
-        </w:rPr>
-        <w:t>He thought of the scrap of red tape from Pema's headguard, still stuck to the cuff of his training jacket.</w:t>
-      </w:r>
-    </w:p>
-    <w:p>
-      <w:r>
-        <w:rPr>
-          <w:b w:val="0"/>
-          <w:i w:val="0"/>
-          <w:strike w:val="0"/>
-        </w:rPr>
-        <w:t>"Yes, Grandmaster."</w:t>
       </w:r>
     </w:p>
     <w:p>

</xml_diff>

<commit_message>
Ch13 final fixes: refusal holds, broken promise, earned closer
Co-Authored-By: Claude Opus 5.5 <noreply@anthropic.com>
</commit_message>
<xml_diff>
--- a/claude-notes/manuscript-v2/13-then-the-guardians-merged.docx
+++ b/claude-notes/manuscript-v2/13-then-the-guardians-merged.docx
@@ -93,7 +93,7 @@
           <w:i w:val="0"/>
           <w:strike w:val="0"/>
         </w:rPr>
-        <w:t>Dev was seven and a blue belt, long in the arm, with the confidence of a boy who had never had to wonder whether his body would obey him. Pema was five, the smallest child on the mat and one rank below him, the Little Dragon who had refused to bow out of class until he accepted her paper crane. Padded gloves, controlled contact, a bow at every fall: the rules existed so Rohan could see what was left of a child once she was tired and no longer sure of winning.</w:t>
+        <w:t>Dev was seven and a blue belt, long in the arm, with the confidence of a boy who had never had to wonder whether his body would obey him. Pema was five, the smallest child on the mat and one rank below him, the Little Dragon who had refused to bow out of class until Rohan accepted her paper crane. Padded gloves, controlled contact, a bow at every fall: the rules existed so Rohan could see what was left of a child once she was tired and no longer sure of winning.</w:t>
       </w:r>
     </w:p>
     <w:p>
@@ -1162,7 +1162,7 @@
           <w:i w:val="0"/>
           <w:strike w:val="0"/>
         </w:rPr>
-        <w:t>"I had a student long ago who fell well," he said. "Better than anyone I have taught since." "The student went below and never came back."</w:t>
+        <w:t>"I had a student long ago who fell well," he said. "Better than anyone I have taught since. The student went below and never came back."</w:t>
       </w:r>
     </w:p>
     <w:p>
@@ -1272,7 +1272,7 @@
           <w:i w:val="0"/>
           <w:strike w:val="0"/>
         </w:rPr>
-        <w:t>"It told me, too, that she stood up at her console on intake morning, and in the same minute a dead miner's number cleared for his son. A held slot does not clear because a monitor stands. It did not tell me who cleared it. Either she would not say, or you would not."</w:t>
+        <w:t>"Your request also told me that she stood up at her console on intake morning, and in the same minute a dead miner's number cleared for his son. A held slot does not clear because a monitor stands. It did not tell me who cleared it. Either she would not say, or you would not."</w:t>
       </w:r>
     </w:p>
     <w:p>
@@ -1292,7 +1292,7 @@
           <w:i w:val="0"/>
           <w:strike w:val="0"/>
         </w:rPr>
-        <w:t>"Then I am asking you. Someone inside Drona cleared Thorton's slot on her signal, and whoever it was is the nearest door we have into that house. Find me the name."</w:t>
+        <w:t>"Then I am asking you. Someone inside Drona cleared Thorton's slot for his son on her signal, and whoever it was is the nearest door we have into that house. Find me the name."</w:t>
       </w:r>
     </w:p>
     <w:p>
@@ -1382,7 +1382,7 @@
           <w:i w:val="0"/>
           <w:strike w:val="0"/>
         </w:rPr>
-        <w:t>He thought of the scrap of red tape from Pema's headguard, still stuck, he realized, to the sleeve of the training jacket he'd left hanging by the door.</w:t>
+        <w:t>He thought of the scrap of red tape from Pema's headguard, still stuck, he realized, to the sleeve of the training jacket he'd left hanging by the door, and of the promise the children had made him give before they let him go.</w:t>
       </w:r>
     </w:p>
     <w:p>
@@ -1402,7 +1402,7 @@
           <w:i w:val="0"/>
           <w:strike w:val="0"/>
         </w:rPr>
-        <w:t>"If you had given me the name," the Grandmaster said, "I would have had a name, and no one I could trust with the rest of it." She unfolded her hands. "Four of Ashoka's investigators will be placed at your disposal. Quiet ones, chosen for discretion, answerable to you alone. Follow the altered records, the permissions no one signed, the resources that move without explanation. Do what seems right according to your code."</w:t>
+        <w:t>"If you had given me the name," the Grandmaster said, "I would have had a name, and no one I could trust with the rest of it." She unfolded her hands. "Four of Ashoka's investigators will be placed at your disposal. Quiet ones, chosen for discretion, answerable to you alone. Follow the altered records, the permissions no one signed, the resources that move without explanation. If the trail reaches the hand that cleared that slot, the name comes to me, not to you. Do what seems right according to your code."</w:t>
       </w:r>
     </w:p>
     <w:p>
@@ -1512,7 +1512,7 @@
           <w:i w:val="0"/>
           <w:strike w:val="0"/>
         </w:rPr>
-        <w:t>Rohan had no answer.</w:t>
+        <w:t>Rohan thought of the step he had taken between Elara and Daren, and could not tell whether it was courage or only the nearest place to stand.</w:t>
       </w:r>
     </w:p>
     <w:p>

</xml_diff>